<commit_message>
Fix remaining French passages in English translation and KDP file
Translated 14 paragraphs missed in the initial pass (epilogue closing,
Lafarge/Castel section, bibliography header/body, closing motto).
Removed 2 duplicate French attribution lines. All 486 paragraphs now
fully in English (US).

https://claude.ai/code/session_01AcYUBsVb6AAEgmkQXpa8dS
</commit_message>
<xml_diff>
--- a/PEACE_CAN_BE_AVOIDED_english_usa.docx
+++ b/PEACE_CAN_BE_AVOIDED_english_usa.docx
@@ -8753,7 +8753,6 @@
           <w:sz w:val="22"/>
           <w:szCs w:val="22"/>
         </w:rPr>
-        <w:t>Le sommet du 6 juillet 2024 au Centre international de conférence Mahatma Gandhi de Niamey produit quatre documents engageant les trois États : un traité portant création de la Confédération de l’AES ; un règlement intérieur du collège des chefs d’État ; un communiqué final en 25 points ; et la Déclaration de Niamey. Ce n’est pas une déclaration d’intention. C’est un corpus juridique. Sur la CEDEAO, Tiani est sans ambiguïté.</w:t>
       </w:r>
     </w:p>
     <w:p>
@@ -13097,7 +13096,7 @@
           <w:sz w:val="22"/>
           <w:szCs w:val="22"/>
         </w:rPr>
-        <w:t>Lafarge : ex-dirigeants condamnés le 13 avril 2026 (6 et 5 ans de prison ferme) pour financement du terrorisme en Syrie. [RTL France] Le groupe Castel dans le viseur du parquet antiterroriste français pour financement de milices armées en RCA. [France Inter, 26 mai 2023] Ces deux condamnations valident un principe que les panafricanistes énoncent depuis des décennies : les entreprises françaises en Afrique financent parfois les conflits qui justifient leur présence sécuritaire.</w:t>
+        <w:t>Lafarge: former executives convicted on April 13, 2026 (6 and 5 years in prison) for financing terrorism in Syria. [RTL France] The Castel Group under scrutiny from the French counter-terrorism prosecutor's office for financing armed militias in the CAR. [France Inter, May 26, 2023] These two convictions validate a principle pan-Africanists have stated for decades: French companies in Africa sometimes finance the very conflicts that justify their security presence.</w:t>
       </w:r>
     </w:p>
     <w:p>
@@ -14129,7 +14128,6 @@
           <w:sz w:val="18"/>
           <w:szCs w:val="18"/>
         </w:rPr>
-        <w:t>— Jonathan Batenguène, Panafrican Média TV, 10 mai 2026</w:t>
       </w:r>
     </w:p>
     <w:p>
@@ -15364,22 +15362,22 @@
           <w:sz w:val="22"/>
           <w:szCs w:val="22"/>
         </w:rPr>
-        <w:t>Ils ont sous-estimé la jeunesse. La population sahélienne a une médiane d’âge inférieure à 18 ans. Ces jeunes ont grandi avec Internet, avec les données IDH disponibles en ligne, avec les images de Barkhane en retraite et de la Charte du Liptako-Gourma en signature. Ils ont vu la différence entre les promesses et les réalités. Ils ont choisi.</w:t>
-      </w:r>
-    </w:p>
-    <w:p>
-      <w:pPr>
-        <w:spacing w:before="100" w:after="100" w:line="330" w:lineRule="auto"/>
-        <w:jc w:val="both"/>
-      </w:pPr>
-      <w:r>
-        <w:rPr>
-          <w:rFonts w:ascii="Georgia" w:eastAsia="Georgia" w:hAnsi="Georgia" w:cs="Georgia"/>
-          <w:color w:val="1A1A1A"/>
-          <w:sz w:val="22"/>
-          <w:szCs w:val="22"/>
-        </w:rPr>
-        <w:t>Ils ont sous-estimé la doctrine. L’AES n’est pas une réaction émotionnelle. C’est un projet construit. Il a un cadre institutionnel. Il a une logique d’escalade qui rend chaque étape plus difficile à annuler que la précédente. La Charte du Liptako-Gourma, le retrait de la CEDEAO, la dénonciation des conventions fiscales, la Force Unifiée — chaque acte construit sur le précédent. Ce n’est pas de l’improvisation. C’est de l’architecture.</w:t>
+        <w:t>They underestimated youth. The Sahelian population has a median age below 18 years. These young people grew up with the internet, with HDI data available online, with images of Barkhane in retreat and the Liptako-Gourma Charter being signed. They saw the gap between promises and realities. They chose.</w:t>
+      </w:r>
+    </w:p>
+    <w:p>
+      <w:pPr>
+        <w:spacing w:before="100" w:after="100" w:line="330" w:lineRule="auto"/>
+        <w:jc w:val="both"/>
+      </w:pPr>
+      <w:r>
+        <w:rPr>
+          <w:rFonts w:ascii="Georgia" w:eastAsia="Georgia" w:hAnsi="Georgia" w:cs="Georgia"/>
+          <w:color w:val="1A1A1A"/>
+          <w:sz w:val="22"/>
+          <w:szCs w:val="22"/>
+        </w:rPr>
+        <w:t>They underestimated the doctrine. The AES is not an emotional reaction. It is a constructed project. It has an institutional framework. It has an escalation logic that makes each step harder to reverse than the previous one. The Liptako-Gourma Charter, the withdrawal from ECOWAS, the denunciation of tax treaties, the Unified Force — each act builds on the previous one. This is not improvisation. It is architecture.</w:t>
       </w:r>
     </w:p>
     <w:p>
@@ -15410,22 +15408,22 @@
           <w:sz w:val="22"/>
           <w:szCs w:val="22"/>
         </w:rPr>
-        <w:t>Ce livre ne vous a pas promis que l’AES réussirait. Personne ne peut le promettre. L’histoire est ouverte. Les obstacles sont réels. Les ennemis sont nombreux, riches et déterminés.</w:t>
-      </w:r>
-    </w:p>
-    <w:p>
-      <w:pPr>
-        <w:spacing w:before="100" w:after="100" w:line="330" w:lineRule="auto"/>
-        <w:jc w:val="both"/>
-      </w:pPr>
-      <w:r>
-        <w:rPr>
-          <w:rFonts w:ascii="Georgia" w:eastAsia="Georgia" w:hAnsi="Georgia" w:cs="Georgia"/>
-          <w:color w:val="1A1A1A"/>
-          <w:sz w:val="22"/>
-          <w:szCs w:val="22"/>
-        </w:rPr>
-        <w:t>Ce livre vous a promis de l’analyser sérieusement. Sans condescendance. Sans la présomption que des Africains en uniforme ne peuvent pas construire ce que des Européens en costume n’ont pas voulu construire pour eux.</w:t>
+        <w:t>This book did not promise you that the AES would succeed. No one can promise that. History is open. The obstacles are real. The enemies are numerous, wealthy, and determined.</w:t>
+      </w:r>
+    </w:p>
+    <w:p>
+      <w:pPr>
+        <w:spacing w:before="100" w:after="100" w:line="330" w:lineRule="auto"/>
+        <w:jc w:val="both"/>
+      </w:pPr>
+      <w:r>
+        <w:rPr>
+          <w:rFonts w:ascii="Georgia" w:eastAsia="Georgia" w:hAnsi="Georgia" w:cs="Georgia"/>
+          <w:color w:val="1A1A1A"/>
+          <w:sz w:val="22"/>
+          <w:szCs w:val="22"/>
+        </w:rPr>
+        <w:t>This book promised you to analyze it seriously. Without condescension. Without the presumption that Africans in uniform cannot build what Europeans in suits were unwilling to build for them.</w:t>
       </w:r>
     </w:p>
     <w:p>
@@ -15501,37 +15499,37 @@
           <w:sz w:val="22"/>
           <w:szCs w:val="22"/>
         </w:rPr>
-        <w:t>La justice ne peut pas être évitée.</w:t>
-      </w:r>
-    </w:p>
-    <w:p>
-      <w:pPr>
-        <w:spacing w:before="100" w:after="100" w:line="330" w:lineRule="auto"/>
-        <w:jc w:val="both"/>
-      </w:pPr>
-      <w:r>
-        <w:rPr>
-          <w:rFonts w:ascii="Georgia" w:eastAsia="Georgia" w:hAnsi="Georgia" w:cs="Georgia"/>
-          <w:color w:val="1A1A1A"/>
-          <w:sz w:val="22"/>
-          <w:szCs w:val="22"/>
-        </w:rPr>
-        <w:t>La dignité, non.</w:t>
-      </w:r>
-    </w:p>
-    <w:p>
-      <w:pPr>
-        <w:spacing w:before="100" w:after="100" w:line="330" w:lineRule="auto"/>
-        <w:jc w:val="both"/>
-      </w:pPr>
-      <w:r>
-        <w:rPr>
-          <w:rFonts w:ascii="Georgia" w:eastAsia="Georgia" w:hAnsi="Georgia" w:cs="Georgia"/>
-          <w:color w:val="1A1A1A"/>
-          <w:sz w:val="22"/>
-          <w:szCs w:val="22"/>
-        </w:rPr>
-        <w:t>La liberté, jamais.</w:t>
+        <w:t>Justice cannot be avoided.</w:t>
+      </w:r>
+    </w:p>
+    <w:p>
+      <w:pPr>
+        <w:spacing w:before="100" w:after="100" w:line="330" w:lineRule="auto"/>
+        <w:jc w:val="both"/>
+      </w:pPr>
+      <w:r>
+        <w:rPr>
+          <w:rFonts w:ascii="Georgia" w:eastAsia="Georgia" w:hAnsi="Georgia" w:cs="Georgia"/>
+          <w:color w:val="1A1A1A"/>
+          <w:sz w:val="22"/>
+          <w:szCs w:val="22"/>
+        </w:rPr>
+        <w:t>Dignity, never.</w:t>
+      </w:r>
+    </w:p>
+    <w:p>
+      <w:pPr>
+        <w:spacing w:before="100" w:after="100" w:line="330" w:lineRule="auto"/>
+        <w:jc w:val="both"/>
+      </w:pPr>
+      <w:r>
+        <w:rPr>
+          <w:rFonts w:ascii="Georgia" w:eastAsia="Georgia" w:hAnsi="Georgia" w:cs="Georgia"/>
+          <w:color w:val="1A1A1A"/>
+          <w:sz w:val="22"/>
+          <w:szCs w:val="22"/>
+        </w:rPr>
+        <w:t>Freedom, never.</w:t>
       </w:r>
     </w:p>
     <w:p>
@@ -15702,22 +15700,22 @@
           <w:sz w:val="22"/>
           <w:szCs w:val="22"/>
         </w:rPr>
-        <w:t>SOURCES ADVERSES FRANÇAISES</w:t>
-      </w:r>
-    </w:p>
-    <w:p>
-      <w:pPr>
-        <w:spacing w:before="100" w:after="100" w:line="330" w:lineRule="auto"/>
-        <w:jc w:val="both"/>
-      </w:pPr>
-      <w:r>
-        <w:rPr>
-          <w:rFonts w:ascii="Georgia" w:eastAsia="Georgia" w:hAnsi="Georgia" w:cs="Georgia"/>
-          <w:color w:val="1A1A1A"/>
-          <w:sz w:val="22"/>
-          <w:szCs w:val="22"/>
-        </w:rPr>
-        <w:t>RTL France, George Malbruno (09/05/2026 — ex-légionnaires + GUR). Thomas Dietrich : Bénin (13/07/2024) + L’armée fantôme de Paris. André Bourgeot, CNRS. Anne-Sophie Avé, ancienne ambassadrice Mali / Directrice Afrique Quai d’Orsay. Alain Juillet, ancien directeur DGSE, Haut Responsable Intelligence Économique. Commission parlementaire française, rapport France-Afrique. Général Thierry Burkhard, huis clos sept. 2024. Fanny Pigeaud, Mediapart. Thomas Porcher, PSB Paris. Jean-Yves Le Drian (France 5, oct. 2021). Le Monde / Jérémie Baruch (10/04/2018 — Elf). Le Parisien / Ronan Folgoas (21/05/2023 — Quignolot + cellule Elysée). Charles Pasqua (Le Parisien, 01/03/2001 — Elf pompe à finances). RTL France (13/04/2026 — Lafarge condamné). France Inter / Elodie Guéguen (26/05/2023 — Castel parquet antiterroriste). André Chassaigne, Assemblée nationale (déc. 2013 — 50e intervention, RCA).</w:t>
+        <w:t>FRENCH ADVERSARIAL SOURCES</w:t>
+      </w:r>
+    </w:p>
+    <w:p>
+      <w:pPr>
+        <w:spacing w:before="100" w:after="100" w:line="330" w:lineRule="auto"/>
+        <w:jc w:val="both"/>
+      </w:pPr>
+      <w:r>
+        <w:rPr>
+          <w:rFonts w:ascii="Georgia" w:eastAsia="Georgia" w:hAnsi="Georgia" w:cs="Georgia"/>
+          <w:color w:val="1A1A1A"/>
+          <w:sz w:val="22"/>
+          <w:szCs w:val="22"/>
+        </w:rPr>
+        <w:t>RTL France, George Malbruno (05/09/2026 — former legionnaires + GUR). Thomas Dietrich: Benin (07/13/2024) + The Ghost Army of Paris. André Bourgeot, CNRS. Anne-Sophie Avé, former ambassador to Mali / Africa Director at the Quai d'Orsay. Alain Juillet, former DGSE director, Senior Official for Economic Intelligence. French parliamentary commission, France-Africa report. General Thierry Burkhard, closed session September 2024. Fanny Pigeaud, Mediapart. Thomas Porcher, PSB Paris. Jean-Yves Le Drian (France 5, October 2021). Le Monde / Jérémie Baruch (04/10/2018 — Elf). Le Parisien / Ronan Folgoas (05/21/2023 — Quignolot + Élysée cell). Charles Pasqua (Le Parisien, 03/01/2001 — Elf funding machine). RTL France (04/13/2026 — Lafarge convicted). France Inter / Élodie Guéguen (05/26/2023 — Castel counter-terrorism prosecutor). André Chassaigne, National Assembly (December 2013 — 50th intervention, CAR).</w:t>
       </w:r>
       <w:proofErr w:type="spellStart"/>
       <w:r>
@@ -15849,7 +15847,7 @@
           <w:sz w:val="22"/>
           <w:szCs w:val="22"/>
         </w:rPr>
-        <w:t>La rigueur n’est pas l’apanage de ceux qui dominent. Elle est l’arme de ceux qui résistent.</w:t>
+        <w:t>Rigor is not the prerogative of those who dominate. It is the weapon of those who resist.</w:t>
       </w:r>
     </w:p>
     <w:p>
@@ -15907,7 +15905,7 @@
           <w:sz w:val="28"/>
           <w:szCs w:val="28"/>
         </w:rPr>
-        <w:t>LA PAIX, ON PEUT L’ÉVITER.</w:t>
+        <w:t>PEACE, WE CAN AVOID IT.</w:t>
       </w:r>
     </w:p>
     <w:p>
@@ -15924,7 +15922,7 @@
           <w:sz w:val="28"/>
           <w:szCs w:val="28"/>
         </w:rPr>
-        <w:t>MAIS LA JUSTICE, NON.</w:t>
+        <w:t>BUT NOT JUSTICE.</w:t>
       </w:r>
     </w:p>
     <w:p>
@@ -15955,7 +15953,7 @@
           <w:iCs/>
           <w:color w:val="7A6535"/>
         </w:rPr>
-        <w:t>« Restons vigilants. » — Général Tiani, 13 novembre 2025</w:t>
+        <w:t>“Stay vigilant.” — General Tiani, November 13, 2025</w:t>
       </w:r>
     </w:p>
     <w:p>

</xml_diff>